<commit_message>
Save work before switching to desktop
Co-Authored-By: Claude Opus 5.5 <noreply@anthropic.com>
</commit_message>
<xml_diff>
--- a/my-work (outputs)/prospects/outreach/sales-intelligence/2026.10.06 - Outreach - Sales Intelligence - Grid.docx
+++ b/my-work (outputs)/prospects/outreach/sales-intelligence/2026.10.06 - Outreach - Sales Intelligence - Grid.docx
@@ -17,7 +17,7 @@
           <w:color w:val="55575A"/>
           <w:sz w:val="18"/>
         </w:rPr>
-        <w:t>Draft for Kate, 2026.10.06. Stage 1 confirmed 9/27. Stage 2 confirmed 9/29 (rebuilt from the Touchpoint 2 Plan). Stages 3 to 5 are reworked from the 9/27 six-stage drafts into the five-stage structure and none are confirmed. Thesis: what data should we build next year's budget and plan on. Addressee: the CEO or President, with the whole leadership team watching. Audience: the 50 Sales Intelligence contacts in Zoho.</w:t>
+        <w:t>Draft for Kate, updated 2026.10.07. Stage 1 confirmed 9/27. Stage 2 confirmed 9/29 (rebuilt from the Touchpoint 2 Plan). Stage 3 confirmed 10/7, row by row. Stages 4 and 5 are reworked from the 9/27 six-stage drafts into the five-stage structure and are not confirmed. Thesis: what data should we build next year's budget and plan on. Addressee: the CEO or President, with the whole leadership team watching. Audience: the 50 Sales Intelligence contacts in Zoho.</w:t>
       </w:r>
     </w:p>
     <w:tbl>
@@ -86,14 +86,8 @@
             <w:shd w:val="clear" w:color="auto" w:fill="B52372"/>
           </w:tcPr>
           <w:p>
-            <w:r/>
             <w:r>
-              <w:rPr>
-                <w:b/>
-                <w:color w:val="FFFFFF"/>
-                <w:sz w:val="18"/>
-              </w:rPr>
-              <w:t>3. Explore (draft, next to walk)</w:t>
+              <w:t>3. Explore (confirmed 10/7)</w:t>
             </w:r>
           </w:p>
         </w:tc>
@@ -278,49 +272,58 @@
               <w:rPr>
                 <w:b/>
               </w:rPr>
-              <w:t xml:space="preserve">What changed:</w:t>
+              <w:t xml:space="preserve">What changed: </w:t>
             </w:r>
             <w:r>
-              <w:t xml:space="preserve"> they accept the plan question is the real one and are exploring how to answer it. Seeking information, not choosing yet. The functions' numbers still don't reconcile.</w:t>
+              <w:t>they've taken the Touch 2 question seriously. They see the plan, not the tools, is what needs fixing, and they're gathering information, not choosing anyone yet.</w:t>
             </w:r>
           </w:p>
+          <w:p/>
           <w:p>
-            <w:pPr>
-              <w:spacing w:after="20"/>
-            </w:pPr>
-          </w:p>
-          <w:p>
-            <w:pPr>
-              <w:spacing w:after="20"/>
-            </w:pPr>
             <w:r>
-              <w:t xml:space="preserve">CEO: "We can't fund everything. Which accounts and segments earn their place?" "If we could only bet on three things next year, which three?" "How do I show the board this plan closes the gap, not just hopes to?"</w:t>
+              <w:rPr>
+                <w:b/>
+              </w:rPr>
+              <w:t xml:space="preserve">CEO: </w:t>
+            </w:r>
+            <w:r>
+              <w:t>"We can't fund everything. Which accounts and segments earn their place?" "If we could only bet on three things next year, which three?" "How do I show the board this plan closes the gap and doesn't just hope to?" "Can my team take this on in planning season, and will they actually change how they work, or does it fade by February?"</w:t>
             </w:r>
           </w:p>
+          <w:p/>
           <w:p>
-            <w:pPr>
-              <w:spacing w:after="20"/>
-            </w:pPr>
-          </w:p>
-          <w:p>
-            <w:pPr>
-              <w:spacing w:after="20"/>
-            </w:pPr>
             <w:r>
-              <w:t xml:space="preserve">Feeling: surer about what has to happen, anxious about how and how fast. The clock is the board meeting.</w:t>
+              <w:rPr>
+                <w:b/>
+              </w:rPr>
+              <w:t xml:space="preserve">Feeling: </w:t>
+            </w:r>
+            <w:r>
+              <w:t>surer about what has to happen, anxious about how and how fast. The clock is the board meeting, and the team is already stretched.</w:t>
             </w:r>
           </w:p>
+          <w:p/>
           <w:p>
-            <w:pPr>
-              <w:spacing w:after="20"/>
-            </w:pPr>
+            <w:r>
+              <w:rPr>
+                <w:b/>
+              </w:rPr>
+              <w:t xml:space="preserve">Head of sales: </w:t>
+            </w:r>
+            <w:r>
+              <w:t>"Another integration. We already have the data tools, the intent feeds and the sequencing platform, and my team is tired of one more login." "How do we know what gives us the best results to put the whole team behind?" "Can it be executed across teams and regions without a six-month rollout?" Open, wanting a real answer, wary of one more thing, protective of the team's hours.</w:t>
+            </w:r>
           </w:p>
+          <w:p/>
           <w:p>
-            <w:pPr>
-              <w:spacing w:after="20"/>
-            </w:pPr>
             <w:r>
-              <w:t xml:space="preserve">Committee: CFO wants the gap in dollars. Sales wants to know which accounts get the best people. Marketing wants to cut what doesn't work without losing what does. CTO is realizing the AI platform on the shortlist finds contacts, not priorities.</w:t>
+              <w:rPr>
+                <w:b/>
+              </w:rPr>
+              <w:t xml:space="preserve">The rest of the team, all on the same side: </w:t>
+            </w:r>
+            <w:r>
+              <w:t>the CFO wants the gap in dollars. The CMO wants to cut what isn't working without losing what is. The COO and HR worry about the change load on people who are already full. The CTO sees that the AI platform on the shortlist finds contacts, not priorities. They aren't resisting. They're at capacity.</w:t>
             </w:r>
           </w:p>
         </w:tc>
@@ -534,39 +537,25 @@
               <w:spacing w:after="20"/>
             </w:pPr>
             <w:r>
-              <w:t xml:space="preserve">Choosing the few bets that close the gap.</w:t>
+              <w:rPr>
+                <w:b/>
+              </w:rPr>
+              <w:t xml:space="preserve">Shared: </w:t>
+            </w:r>
+            <w:r>
+              <w:t>choosing the few bets that close the gap. Where money and people earn the best return. Performance and ROI: which investments are paying back and which aren't. A board-ready story that ties actions to dollars. The answer before the budget locks. Protecting the team's time in planning season, and change that sticks.</w:t>
             </w:r>
           </w:p>
+          <w:p/>
           <w:p>
-            <w:pPr>
-              <w:spacing w:after="20"/>
-            </w:pPr>
             <w:r>
-              <w:t xml:space="preserve">Putting money and people where the return is.</w:t>
+              <w:rPr>
+                <w:b/>
+              </w:rPr>
+              <w:t xml:space="preserve">By role: </w:t>
             </w:r>
-          </w:p>
-          <w:p>
-            <w:pPr>
-              <w:spacing w:after="20"/>
-            </w:pPr>
             <w:r>
-              <w:t xml:space="preserve">A board-ready story that ties actions to dollars.</w:t>
-            </w:r>
-          </w:p>
-          <w:p>
-            <w:pPr>
-              <w:spacing w:after="20"/>
-            </w:pPr>
-            <w:r>
-              <w:t xml:space="preserve">Speed: done before the board approves the budget.</w:t>
-            </w:r>
-          </w:p>
-          <w:p>
-            <w:pPr>
-              <w:spacing w:after="20"/>
-            </w:pPr>
-            <w:r>
-              <w:t xml:space="preserve">Committee: CFO wants the gap quantified, sales wants the account list, marketing wants permission to cut.</w:t>
+              <w:t>CFO, the gap in dollars and the ROI on what's spent. Head of sales, what really gives the best results when everyone has the same tools and lists, the performance and ROI of sales effort, and a plan every team and region can run. CMO, the ROI of marketing spend and what to cut and keep. COO and HR, the return on the change and the pace people can absorb. CTO, the performance and ROI of the technology stack, and keeping it simple.</w:t>
             </w:r>
           </w:p>
         </w:tc>
@@ -784,59 +773,25 @@
               <w:spacing w:after="20"/>
             </w:pPr>
             <w:r>
-              <w:t xml:space="preserve">Gap math: set the target, see current, see the gap in dollars.</w:t>
+              <w:t>Ranking customers and segments by revenue and profit together (the Ignition Score, presented as our method). Gap math: target, current and the gap in dollars. Strategy written as a formula: goal, then segment strategy, then tactics. Straight Shot strategies and owned actions, "Do less. Make it mean more."</w:t>
             </w:r>
           </w:p>
+          <w:p/>
           <w:p>
-            <w:pPr>
-              <w:spacing w:after="20"/>
-            </w:pPr>
-          </w:p>
-          <w:p>
-            <w:pPr>
-              <w:spacing w:after="20"/>
-            </w:pPr>
             <w:r>
-              <w:t xml:space="preserve">Ignition Score: segments and accounts ranked by revenue and profit together.</w:t>
+              <w:t>Ignite: revenue roadmap and scenario modeling; strategy turned into owned actions for every team; priority accounts with coordinated sales and marketing moves; agentic SaaS for revenue strategy that keeps the plan current. At Explore it sits behind the insight, never the lead.</w:t>
             </w:r>
           </w:p>
+          <w:p/>
           <w:p>
-            <w:pPr>
-              <w:spacing w:after="20"/>
-            </w:pPr>
-          </w:p>
-          <w:p>
-            <w:pPr>
-              <w:spacing w:after="20"/>
-            </w:pPr>
             <w:r>
-              <w:t xml:space="preserve">Straight Shot strategies with owned actions that ladder up to revenue. Ripple Effect scenario modeling. The Vision-to-Value Roadmap. "Do less. Make it mean more."</w:t>
+              <w:t>The Vision-to-Value Roadmap, sized to the team's capacity. Outside-In Thinking and 28 years of budget reviews. Our own data: 5% of initiatives aimed at the most valuable customers, 90% of tactics not aligned to strategy, 15.5 hours per unit on a marketing plan nobody used. The paper and the check.</w:t>
             </w:r>
           </w:p>
+          <w:p/>
           <w:p>
-            <w:pPr>
-              <w:spacing w:after="20"/>
-            </w:pPr>
-          </w:p>
-          <w:p>
-            <w:pPr>
-              <w:spacing w:after="20"/>
-            </w:pPr>
             <w:r>
-              <w:t xml:space="preserve">The single source of truth Kate recommended to a management group before Ignite existed (never named): their teams spent 15.5 hours per unit on a marketing plan nobody used.</w:t>
-            </w:r>
-          </w:p>
-          <w:p>
-            <w:pPr>
-              <w:spacing w:after="20"/>
-            </w:pPr>
-          </w:p>
-          <w:p>
-            <w:pPr>
-              <w:spacing w:after="20"/>
-            </w:pPr>
-            <w:r>
-              <w:t xml:space="preserve">Thought leadership: the report, Right, or Just Lucky?</w:t>
+              <w:t>Held back: Ignite is in beta and not ready for customers' day-to-day use, realized lift isn't proven, and the cross-region layer is still being built.</w:t>
             </w:r>
           </w:p>
         </w:tc>
@@ -985,7 +940,19 @@
               <w:spacing w:after="20"/>
             </w:pPr>
             <w:r>
-              <w:t xml:space="preserve">The plan becomes a short list of bets, each tied to a dollar amount, with the gap visible. They walk into the board meeting with math, not adjectives.</w:t>
+              <w:t>Faster through the interstitial spaces, from signal to response, then to result. Each handoff is where time leaks, and nobody owns the gaps.</w:t>
+            </w:r>
+          </w:p>
+          <w:p/>
+          <w:p>
+            <w:r>
+              <w:t>From arriving when everyone else does, to arriving first. Same data, same tools. The advantage is the time from signal to result.</w:t>
+            </w:r>
+          </w:p>
+          <w:p/>
+          <w:p>
+            <w:r>
+              <w:t>A ranked answer to "which three?" One plan every team and region runs, with owners and dollars. Capacity made by doing less. Math at the board meeting, with ROI on each bet.</w:t>
             </w:r>
           </w:p>
         </w:tc>
@@ -1123,26 +1090,19 @@
               <w:spacing w:after="20"/>
             </w:pPr>
             <w:r>
-              <w:t xml:space="preserve">Because you know you can't fund everything, we rank where your growth really comes from and show which actions close the gap, so the plan becomes a few bets you can defend instead of a long list you can't.</w:t>
+              <w:t>Because you're focused on choosing the few bets that earn the best return, and you can't afford the months it takes for a signal to become a result, we close the spaces between signal, response and result. We rank where your growth really comes from, turn it into one plan with owners and dollars that every team and region can run, and size the change to the capacity you have, so you get there before everyone else does.</w:t>
             </w:r>
           </w:p>
+          <w:p/>
           <w:p>
-            <w:pPr>
-              <w:spacing w:after="20"/>
-            </w:pPr>
-          </w:p>
-          <w:p>
-            <w:pPr>
-              <w:spacing w:after="20"/>
-            </w:pPr>
             <w:r>
               <w:rPr>
                 <w:b/>
               </w:rPr>
-              <w:t xml:space="preserve">Short:</w:t>
+              <w:t xml:space="preserve">Short: </w:t>
             </w:r>
             <w:r>
-              <w:t xml:space="preserve"> Do less. Make it mean more.</w:t>
+              <w:t>Same data as everyone. Get to the result first.</w:t>
             </w:r>
           </w:p>
         </w:tc>
@@ -1322,68 +1282,31 @@
               <w:spacing w:after="20"/>
             </w:pPr>
             <w:r>
+              <w:t>"Someone spotted it. Maybe someone heard it. Months later, you're looking for any shred of evidence it worked." (Confirmed by Kate 10/7.)</w:t>
+            </w:r>
+          </w:p>
+          <w:p/>
+          <w:p>
+            <w:r>
               <w:rPr>
                 <w:b/>
               </w:rPr>
-              <w:t xml:space="preserve">Draft:</w:t>
+              <w:t xml:space="preserve">Payoff: </w:t>
             </w:r>
             <w:r>
-              <w:t xml:space="preserve"> "If you could only fund three things next year, would you know which three?"</w:t>
+              <w:t>"Do less. Make it mean more." Closing question: "How long does it take yours to get from signal to result?"</w:t>
             </w:r>
           </w:p>
+          <w:p/>
           <w:p>
-            <w:pPr>
-              <w:spacing w:after="20"/>
-            </w:pPr>
-          </w:p>
-          <w:p>
-            <w:pPr>
-              <w:spacing w:after="20"/>
-            </w:pPr>
-            <w:r>
-              <w:t xml:space="preserve">Payoff: "Do less. Make it mean more."</w:t>
-            </w:r>
-          </w:p>
-          <w:p>
-            <w:pPr>
-              <w:spacing w:after="20"/>
-            </w:pPr>
-          </w:p>
-          <w:p>
-            <w:pPr>
-              <w:spacing w:after="20"/>
-            </w:pPr>
-            <w:r>
-              <w:t xml:space="preserve">Alternate, cheeky: "Your plan has 27 priorities. Pick three."</w:t>
-            </w:r>
-          </w:p>
-          <w:p>
-            <w:pPr>
-              <w:spacing w:after="20"/>
-            </w:pPr>
-          </w:p>
-          <w:p>
-            <w:pPr>
-              <w:spacing w:after="20"/>
-            </w:pPr>
-            <w:r>
-              <w:t xml:space="preserve">Visual: the coin still spinning over a spreadsheet where most rows fade to grey and three light up in raspberry.</w:t>
-            </w:r>
-          </w:p>
-          <w:p>
-            <w:pPr>
-              <w:spacing w:after="20"/>
-            </w:pPr>
-          </w:p>
-          <w:p>
-            <w:pPr>
-              <w:spacing w:after="20"/>
-            </w:pPr>
             <w:r>
               <w:rPr>
-                <w:i/>
+                <w:b/>
               </w:rPr>
-              <w:t xml:space="preserve">Not confirmed. This is where the grid walk starts.</w:t>
+              <w:t xml:space="preserve">Visual: </w:t>
+            </w:r>
+            <w:r>
+              <w:t>the coin spinning in the gap between SIGNAL and RESULT, with the gap closing.</w:t>
             </w:r>
           </w:p>
         </w:tc>

</xml_diff>